<commit_message>
Etap 1: uzupełnione wersje technologii w dokumentacji (JDK, Maven, Tomcat)
</commit_message>
<xml_diff>
--- a/docs/Dokumentacja_Szczyt_Lutchenko.docx
+++ b/docs/Dokumentacja_Szczyt_Lutchenko.docx
@@ -290,7 +290,7 @@
           </w:tcPr>
           <w:p>
             <w:r>
-              <w:t>21</w:t>
+              <w:t>21.0.12 (Temurin 21.0.12.1+1)</w:t>
             </w:r>
           </w:p>
         </w:tc>
@@ -322,7 +322,7 @@
           </w:tcPr>
           <w:p>
             <w:r>
-              <w:t>wbudowany w IntelliJ IDEA</w:t>
+              <w:t>3.9.9</w:t>
             </w:r>
           </w:p>
         </w:tc>
@@ -354,7 +354,7 @@
           </w:tcPr>
           <w:p>
             <w:r>
-              <w:t>10.1</w:t>
+              <w:t>10.1.34</w:t>
             </w:r>
           </w:p>
         </w:tc>
@@ -418,7 +418,7 @@
           </w:tcPr>
           <w:p>
             <w:r>
-              <w:t>3.0</w:t>
+              <w:t>3.0.0 (API), 3.0.1 (implementacja GlassFish)</w:t>
             </w:r>
           </w:p>
         </w:tc>

</xml_diff>